<commit_message>
Fix: formatting, education grades, and resume update
</commit_message>
<xml_diff>
--- a/public/Aditya_Janjanam_Resume.docx
+++ b/public/Aditya_Janjanam_Resume.docx
@@ -225,7 +225,7 @@
           </mc:Choice>
           <mc:Fallback>
             <w:pict>
-              <v:shape w14:anchorId="1460A798" id="Graphic 5" o:spid="_x0000_s1026" style="position:absolute;margin-left:36pt;margin-top:5.2pt;width:540pt;height:.1pt;z-index:251534336;visibility:visible;mso-wrap-style:square;mso-wrap-distance-left:0;mso-wrap-distance-top:0;mso-wrap-distance-right:0;mso-wrap-distance-bottom:0;mso-position-horizontal:absolute;mso-position-horizontal-relative:page;mso-position-vertical:absolute;mso-position-vertical-relative:text;v-text-anchor:top" coordsize="6858000,1270" o:gfxdata="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" path="m,l6858000,e" filled="f" strokeweight=".14039mm">
+              <v:shape w14:anchorId="25925C98" id="Graphic 5" o:spid="_x0000_s1026" style="position:absolute;margin-left:36pt;margin-top:5.2pt;width:540pt;height:.1pt;z-index:251534336;visibility:visible;mso-wrap-style:square;mso-wrap-distance-left:0;mso-wrap-distance-top:0;mso-wrap-distance-right:0;mso-wrap-distance-bottom:0;mso-position-horizontal:absolute;mso-position-horizontal-relative:page;mso-position-vertical:absolute;mso-position-vertical-relative:text;v-text-anchor:top" coordsize="6858000,1270" o:gfxdata="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" path="m,l6858000,e" filled="f" strokeweight=".14039mm">
                 <v:path arrowok="t"/>
                 <w10:wrap anchorx="page"/>
               </v:shape>
@@ -734,7 +734,7 @@
           </mc:Choice>
           <mc:Fallback>
             <w:pict>
-              <v:shape w14:anchorId="52C08643" id="Graphic 8" o:spid="_x0000_s1026" style="position:absolute;margin-left:36pt;margin-top:3.9pt;width:540pt;height:.1pt;z-index:251728896;visibility:visible;mso-wrap-style:square;mso-wrap-distance-left:0;mso-wrap-distance-top:0;mso-wrap-distance-right:0;mso-wrap-distance-bottom:0;mso-position-horizontal:absolute;mso-position-horizontal-relative:page;mso-position-vertical:absolute;mso-position-vertical-relative:text;v-text-anchor:top" coordsize="6858000,1270" o:gfxdata="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" path="m,l6858000,e" filled="f" strokeweight=".14039mm">
+              <v:shape w14:anchorId="12424FC8" id="Graphic 8" o:spid="_x0000_s1026" style="position:absolute;margin-left:36pt;margin-top:3.9pt;width:540pt;height:.1pt;z-index:251728896;visibility:visible;mso-wrap-style:square;mso-wrap-distance-left:0;mso-wrap-distance-top:0;mso-wrap-distance-right:0;mso-wrap-distance-bottom:0;mso-position-horizontal:absolute;mso-position-horizontal-relative:page;mso-position-vertical:absolute;mso-position-vertical-relative:text;v-text-anchor:top" coordsize="6858000,1270" o:gfxdata="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" path="m,l6858000,e" filled="f" strokeweight=".14039mm">
                 <v:path arrowok="t"/>
                 <w10:wrap anchorx="page"/>
               </v:shape>
@@ -1337,7 +1337,7 @@
           </mc:Choice>
           <mc:Fallback>
             <w:pict>
-              <v:shape w14:anchorId="563D27EF" id="Graphic 7" o:spid="_x0000_s1026" style="position:absolute;margin-left:36.6pt;margin-top:4.25pt;width:540pt;height:.1pt;z-index:251801600;visibility:visible;mso-wrap-style:square;mso-wrap-distance-left:0;mso-wrap-distance-top:0;mso-wrap-distance-right:0;mso-wrap-distance-bottom:0;mso-position-horizontal:absolute;mso-position-horizontal-relative:page;mso-position-vertical:absolute;mso-position-vertical-relative:text;v-text-anchor:top" coordsize="6858000,1270" o:gfxdata="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" path="m,l6858000,e" filled="f" strokeweight=".14039mm">
+              <v:shape w14:anchorId="3F2D5FFB" id="Graphic 7" o:spid="_x0000_s1026" style="position:absolute;margin-left:36.6pt;margin-top:4.25pt;width:540pt;height:.1pt;z-index:251801600;visibility:visible;mso-wrap-style:square;mso-wrap-distance-left:0;mso-wrap-distance-top:0;mso-wrap-distance-right:0;mso-wrap-distance-bottom:0;mso-position-horizontal:absolute;mso-position-horizontal-relative:page;mso-position-vertical:absolute;mso-position-vertical-relative:text;v-text-anchor:top" coordsize="6858000,1270" o:gfxdata="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" path="m,l6858000,e" filled="f" strokeweight=".14039mm">
                 <v:path arrowok="t"/>
                 <w10:wrap anchorx="page"/>
               </v:shape>
@@ -2317,7 +2317,7 @@
           </mc:Choice>
           <mc:Fallback>
             <w:pict>
-              <v:shape w14:anchorId="25F5EF07" id="Graphic 7" o:spid="_x0000_s1026" style="position:absolute;margin-left:36pt;margin-top:5.7pt;width:540pt;height:.1pt;z-index:251819008;visibility:visible;mso-wrap-style:square;mso-wrap-distance-left:0;mso-wrap-distance-top:0;mso-wrap-distance-right:0;mso-wrap-distance-bottom:0;mso-position-horizontal:absolute;mso-position-horizontal-relative:page;mso-position-vertical:absolute;mso-position-vertical-relative:text;v-text-anchor:top" coordsize="6858000,1270" o:gfxdata="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" path="m,l6858000,e" filled="f" strokeweight=".14039mm">
+              <v:shape w14:anchorId="02CF8108" id="Graphic 7" o:spid="_x0000_s1026" style="position:absolute;margin-left:36pt;margin-top:5.7pt;width:540pt;height:.1pt;z-index:251819008;visibility:visible;mso-wrap-style:square;mso-wrap-distance-left:0;mso-wrap-distance-top:0;mso-wrap-distance-right:0;mso-wrap-distance-bottom:0;mso-position-horizontal:absolute;mso-position-horizontal-relative:page;mso-position-vertical:absolute;mso-position-vertical-relative:text;v-text-anchor:top" coordsize="6858000,1270" o:gfxdata="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" path="m,l6858000,e" filled="f" strokeweight=".14039mm">
                 <v:path arrowok="t"/>
                 <w10:wrap anchorx="page"/>
               </v:shape>
@@ -2630,7 +2630,7 @@
           </mc:Choice>
           <mc:Fallback>
             <w:pict>
-              <v:shape w14:anchorId="76DA1E8E" id="Graphic 7" o:spid="_x0000_s1026" style="position:absolute;margin-left:36pt;margin-top:5.7pt;width:540pt;height:.1pt;z-index:251563008;visibility:visible;mso-wrap-style:square;mso-wrap-distance-left:0;mso-wrap-distance-top:0;mso-wrap-distance-right:0;mso-wrap-distance-bottom:0;mso-position-horizontal:absolute;mso-position-horizontal-relative:page;mso-position-vertical:absolute;mso-position-vertical-relative:text;v-text-anchor:top" coordsize="6858000,1270" o:gfxdata="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" path="m,l6858000,e" filled="f" strokeweight=".14039mm">
+              <v:shape w14:anchorId="79B05F13" id="Graphic 7" o:spid="_x0000_s1026" style="position:absolute;margin-left:36pt;margin-top:5.7pt;width:540pt;height:.1pt;z-index:251563008;visibility:visible;mso-wrap-style:square;mso-wrap-distance-left:0;mso-wrap-distance-top:0;mso-wrap-distance-right:0;mso-wrap-distance-bottom:0;mso-position-horizontal:absolute;mso-position-horizontal-relative:page;mso-position-vertical:absolute;mso-position-vertical-relative:text;v-text-anchor:top" coordsize="6858000,1270" o:gfxdata="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" path="m,l6858000,e" filled="f" strokeweight=".14039mm">
                 <v:path arrowok="t"/>
                 <w10:wrap anchorx="page"/>
               </v:shape>
@@ -3479,7 +3479,7 @@
           </mc:Choice>
           <mc:Fallback>
             <w:pict>
-              <v:shape w14:anchorId="46FE891B" id="Graphic 8" o:spid="_x0000_s1026" style="position:absolute;margin-left:34.8pt;margin-top:13.85pt;width:540pt;height:.1pt;z-index:251816960;visibility:visible;mso-wrap-style:square;mso-wrap-distance-left:0;mso-wrap-distance-top:0;mso-wrap-distance-right:0;mso-wrap-distance-bottom:0;mso-position-horizontal:absolute;mso-position-horizontal-relative:page;mso-position-vertical:absolute;mso-position-vertical-relative:text;v-text-anchor:top" coordsize="6858000,1270" o:gfxdata="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" path="m,l6858000,e" filled="f" strokeweight=".14039mm">
+              <v:shape w14:anchorId="640664A0" id="Graphic 8" o:spid="_x0000_s1026" style="position:absolute;margin-left:34.8pt;margin-top:13.85pt;width:540pt;height:.1pt;z-index:251816960;visibility:visible;mso-wrap-style:square;mso-wrap-distance-left:0;mso-wrap-distance-top:0;mso-wrap-distance-right:0;mso-wrap-distance-bottom:0;mso-position-horizontal:absolute;mso-position-horizontal-relative:page;mso-position-vertical:absolute;mso-position-vertical-relative:text;v-text-anchor:top" coordsize="6858000,1270" o:gfxdata="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" path="m,l6858000,e" filled="f" strokeweight=".14039mm">
                 <v:path arrowok="t"/>
                 <w10:wrap anchorx="page"/>
               </v:shape>
@@ -3682,7 +3682,7 @@
           </mc:Choice>
           <mc:Fallback>
             <w:pict>
-              <v:shape w14:anchorId="5B1121B8" id="Graphic 8" o:spid="_x0000_s1026" style="position:absolute;margin-left:34.8pt;margin-top:13.85pt;width:540pt;height:.1pt;z-index:251755520;visibility:visible;mso-wrap-style:square;mso-wrap-distance-left:0;mso-wrap-distance-top:0;mso-wrap-distance-right:0;mso-wrap-distance-bottom:0;mso-position-horizontal:absolute;mso-position-horizontal-relative:page;mso-position-vertical:absolute;mso-position-vertical-relative:text;v-text-anchor:top" coordsize="6858000,1270" o:gfxdata="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" path="m,l6858000,e" filled="f" strokeweight=".14039mm">
+              <v:shape w14:anchorId="7ACD5B28" id="Graphic 8" o:spid="_x0000_s1026" style="position:absolute;margin-left:34.8pt;margin-top:13.85pt;width:540pt;height:.1pt;z-index:251755520;visibility:visible;mso-wrap-style:square;mso-wrap-distance-left:0;mso-wrap-distance-top:0;mso-wrap-distance-right:0;mso-wrap-distance-bottom:0;mso-position-horizontal:absolute;mso-position-horizontal-relative:page;mso-position-vertical:absolute;mso-position-vertical-relative:text;v-text-anchor:top" coordsize="6858000,1270" o:gfxdata="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" path="m,l6858000,e" filled="f" strokeweight=".14039mm">
                 <v:path arrowok="t"/>
                 <w10:wrap anchorx="page"/>
               </v:shape>
@@ -3899,27 +3899,13 @@
     </w:p>
     <w:p>
       <w:pPr>
-        <w:jc w:val="both"/>
-        <w:rPr>
-          <w:rFonts w:ascii="Arial" w:hAnsi="Arial" w:cs="Arial"/>
-          <w:iCs/>
-          <w:position w:val="2"/>
-          <w:sz w:val="24"/>
-          <w:szCs w:val="24"/>
-          <w:lang w:val="en-CA"/>
-        </w:rPr>
-      </w:pPr>
-    </w:p>
-    <w:p>
-      <w:pPr>
-        <w:jc w:val="both"/>
         <w:rPr>
           <w:rFonts w:ascii="Arial" w:hAnsi="Arial" w:cs="Arial"/>
           <w:b/>
           <w:bCs/>
           <w:i/>
           <w:iCs/>
-          <w:position w:val="2"/>
+          <w:noProof/>
           <w:sz w:val="24"/>
           <w:szCs w:val="24"/>
           <w:lang w:val="en-CA"/>
@@ -3937,7 +3923,7 @@
         <mc:AlternateContent>
           <mc:Choice Requires="wps">
             <w:drawing>
-              <wp:anchor distT="0" distB="0" distL="0" distR="0" simplePos="0" relativeHeight="251814912" behindDoc="0" locked="0" layoutInCell="1" allowOverlap="1" wp14:anchorId="1F9E2E37" wp14:editId="29291FED">
+              <wp:anchor distT="0" distB="0" distL="0" distR="0" simplePos="0" relativeHeight="251825152" behindDoc="0" locked="0" layoutInCell="1" allowOverlap="1" wp14:anchorId="6D39D61E" wp14:editId="7B002724">
                 <wp:simplePos x="0" y="0"/>
                 <wp:positionH relativeFrom="page">
                   <wp:posOffset>381000</wp:posOffset>
@@ -3948,7 +3934,7 @@
                 <wp:extent cx="6858000" cy="1270"/>
                 <wp:effectExtent l="0" t="0" r="0" b="0"/>
                 <wp:wrapNone/>
-                <wp:docPr id="1212097808" name="Graphic 8"/>
+                <wp:docPr id="1614428705" name="Freeform: Shape 14"/>
                 <wp:cNvGraphicFramePr>
                   <a:graphicFrameLocks xmlns:a="http://schemas.openxmlformats.org/drawingml/2006/main"/>
                 </wp:cNvGraphicFramePr>
@@ -3987,7 +3973,7 @@
                           <a:prstDash val="solid"/>
                         </a:ln>
                       </wps:spPr>
-                      <wps:bodyPr wrap="square" lIns="0" tIns="0" rIns="0" bIns="0" rtlCol="0">
+                      <wps:bodyPr vertOverflow="clip" horzOverflow="clip" wrap="square" lIns="0" tIns="0" rIns="0" bIns="0" rtlCol="0">
                         <a:prstTxWarp prst="textNoShape">
                           <a:avLst/>
                         </a:prstTxWarp>
@@ -3996,12 +3982,18 @@
                     </wps:wsp>
                   </a:graphicData>
                 </a:graphic>
+                <wp14:sizeRelH relativeFrom="page">
+                  <wp14:pctWidth>0</wp14:pctWidth>
+                </wp14:sizeRelH>
+                <wp14:sizeRelV relativeFrom="page">
+                  <wp14:pctHeight>0</wp14:pctHeight>
+                </wp14:sizeRelV>
               </wp:anchor>
             </w:drawing>
           </mc:Choice>
           <mc:Fallback>
             <w:pict>
-              <v:shape w14:anchorId="3A0FCE28" id="Graphic 8" o:spid="_x0000_s1026" style="position:absolute;margin-left:30pt;margin-top:16.5pt;width:540pt;height:.1pt;z-index:251814912;visibility:visible;mso-wrap-style:square;mso-wrap-distance-left:0;mso-wrap-distance-top:0;mso-wrap-distance-right:0;mso-wrap-distance-bottom:0;mso-position-horizontal:absolute;mso-position-horizontal-relative:page;mso-position-vertical:absolute;mso-position-vertical-relative:text;v-text-anchor:top" coordsize="6858000,1270" o:gfxdata="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" path="m,l6858000,e" filled="f" strokeweight=".14039mm">
+              <v:shape w14:anchorId="29842346" id="Freeform: Shape 14" o:spid="_x0000_s1026" style="position:absolute;margin-left:30pt;margin-top:16.5pt;width:540pt;height:.1pt;z-index:251825152;visibility:visible;mso-wrap-style:square;mso-width-percent:0;mso-height-percent:0;mso-wrap-distance-left:0;mso-wrap-distance-top:0;mso-wrap-distance-right:0;mso-wrap-distance-bottom:0;mso-position-horizontal:absolute;mso-position-horizontal-relative:page;mso-position-vertical:absolute;mso-position-vertical-relative:text;mso-width-percent:0;mso-height-percent:0;mso-width-relative:page;mso-height-relative:page;v-text-anchor:top" coordsize="6858000,1270" o:gfxdata="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" path="m,l6858000,e" filled="f" strokeweight=".14039mm">
                 <v:path arrowok="t"/>
                 <w10:wrap anchorx="page"/>
               </v:shape>
@@ -4015,27 +4007,338 @@
           <w:b/>
           <w:bCs/>
           <w:iCs/>
-          <w:position w:val="2"/>
-          <w:sz w:val="24"/>
-          <w:szCs w:val="24"/>
-          <w:lang w:val="en-CA"/>
-        </w:rPr>
-        <w:t>Volunteer</w:t>
-      </w:r>
-      <w:r>
-        <w:rPr>
-          <w:rFonts w:ascii="Arial" w:hAnsi="Arial" w:cs="Arial"/>
-          <w:b/>
-          <w:bCs/>
+          <w:noProof/>
+          <w:sz w:val="24"/>
+          <w:szCs w:val="24"/>
+          <w:lang w:val="en-CA"/>
+        </w:rPr>
+        <w:t xml:space="preserve">Volunteering Experience </w:t>
+      </w:r>
+      <w:r>
+        <w:rPr>
+          <w:rFonts w:ascii="Arial" w:hAnsi="Arial" w:cs="Arial"/>
+          <w:b/>
+          <w:bCs/>
+          <w:iCs/>
+          <w:noProof/>
+          <w:sz w:val="24"/>
+          <w:szCs w:val="24"/>
+          <w:lang w:val="en-CA"/>
+        </w:rPr>
+        <w:br/>
+      </w:r>
+    </w:p>
+    <w:p>
+      <w:pPr>
+        <w:jc w:val="both"/>
+        <w:rPr>
+          <w:rFonts w:ascii="Arial" w:hAnsi="Arial" w:cs="Arial"/>
+          <w:b/>
+          <w:bCs/>
+          <w:noProof/>
+          <w:sz w:val="24"/>
+          <w:szCs w:val="24"/>
+          <w:lang w:val="en-CA"/>
+        </w:rPr>
+      </w:pPr>
+      <w:r>
+        <w:rPr>
+          <w:rFonts w:ascii="Arial" w:hAnsi="Arial" w:cs="Arial"/>
+          <w:b/>
+          <w:bCs/>
+          <w:noProof/>
+          <w:sz w:val="24"/>
+          <w:szCs w:val="24"/>
+          <w:lang w:val="en-CA"/>
+        </w:rPr>
+        <w:t>1.Museum Volunteer – City of Waterloo Museum</w:t>
+      </w:r>
+      <w:r>
+        <w:rPr>
+          <w:rFonts w:ascii="Arial" w:hAnsi="Arial" w:cs="Arial"/>
+          <w:b/>
+          <w:bCs/>
+          <w:noProof/>
+          <w:sz w:val="24"/>
+          <w:szCs w:val="24"/>
+          <w:lang w:val="en-CA"/>
+        </w:rPr>
+        <w:tab/>
+      </w:r>
+      <w:r>
+        <w:rPr>
+          <w:rFonts w:ascii="Arial" w:hAnsi="Arial" w:cs="Arial"/>
+          <w:b/>
+          <w:bCs/>
+          <w:noProof/>
+          <w:sz w:val="24"/>
+          <w:szCs w:val="24"/>
+          <w:lang w:val="en-CA"/>
+        </w:rPr>
+        <w:tab/>
+        <w:t xml:space="preserve">    Waterloo, ON | June 2025 – Present</w:t>
+      </w:r>
+    </w:p>
+    <w:p>
+      <w:pPr>
+        <w:numPr>
+          <w:ilvl w:val="0"/>
+          <w:numId w:val="67"/>
+        </w:numPr>
+        <w:jc w:val="both"/>
+        <w:rPr>
+          <w:rFonts w:ascii="Arial" w:hAnsi="Arial" w:cs="Arial"/>
+          <w:noProof/>
+          <w:sz w:val="24"/>
+          <w:szCs w:val="24"/>
+          <w:lang w:val="en-CA"/>
+        </w:rPr>
+      </w:pPr>
+      <w:r>
+        <w:rPr>
+          <w:rFonts w:ascii="Arial" w:hAnsi="Arial" w:cs="Arial"/>
+          <w:noProof/>
+          <w:sz w:val="24"/>
+          <w:szCs w:val="24"/>
+          <w:lang w:val="en-CA"/>
+        </w:rPr>
+        <w:t>Assisting museum staff with visitor services, exhibit setup, and public engagement.</w:t>
+      </w:r>
+    </w:p>
+    <w:p>
+      <w:pPr>
+        <w:numPr>
+          <w:ilvl w:val="0"/>
+          <w:numId w:val="67"/>
+        </w:numPr>
+        <w:jc w:val="both"/>
+        <w:rPr>
+          <w:rFonts w:ascii="Arial" w:hAnsi="Arial" w:cs="Arial"/>
+          <w:b/>
+          <w:bCs/>
+          <w:noProof/>
+          <w:sz w:val="24"/>
+          <w:szCs w:val="24"/>
+          <w:lang w:val="en-CA"/>
+        </w:rPr>
+      </w:pPr>
+      <w:r>
+        <w:rPr>
+          <w:rFonts w:ascii="Arial" w:hAnsi="Arial" w:cs="Arial"/>
+          <w:noProof/>
+          <w:sz w:val="24"/>
+          <w:szCs w:val="24"/>
+          <w:lang w:val="en-CA"/>
+        </w:rPr>
+        <w:t>Helping create a welcoming atmosphere and supporting educational initiatives.</w:t>
+      </w:r>
+    </w:p>
+    <w:p>
+      <w:pPr>
+        <w:ind w:left="720"/>
+        <w:jc w:val="both"/>
+        <w:rPr>
+          <w:rFonts w:ascii="Arial" w:hAnsi="Arial" w:cs="Arial"/>
+          <w:b/>
+          <w:bCs/>
+          <w:noProof/>
+          <w:sz w:val="24"/>
+          <w:szCs w:val="24"/>
+          <w:lang w:val="en-CA"/>
+        </w:rPr>
+      </w:pPr>
+    </w:p>
+    <w:p>
+      <w:pPr>
+        <w:jc w:val="both"/>
+        <w:rPr>
+          <w:rFonts w:ascii="Arial" w:hAnsi="Arial" w:cs="Arial"/>
+          <w:b/>
+          <w:bCs/>
+          <w:noProof/>
+          <w:sz w:val="24"/>
+          <w:szCs w:val="24"/>
+          <w:lang w:val="en-CA"/>
+        </w:rPr>
+      </w:pPr>
+      <w:r>
+        <w:rPr>
+          <w:rFonts w:ascii="Arial" w:hAnsi="Arial" w:cs="Arial"/>
+          <w:b/>
+          <w:bCs/>
+          <w:noProof/>
+          <w:sz w:val="24"/>
+          <w:szCs w:val="24"/>
+          <w:lang w:val="en-CA"/>
+        </w:rPr>
+        <w:t>2.</w:t>
+      </w:r>
+      <w:r>
+        <w:rPr>
+          <w:rFonts w:ascii="Arial" w:hAnsi="Arial" w:cs="Arial"/>
+          <w:b/>
+          <w:bCs/>
+          <w:noProof/>
+          <w:sz w:val="24"/>
+          <w:szCs w:val="24"/>
+          <w:lang w:val="en-CA"/>
+        </w:rPr>
+        <w:t xml:space="preserve"> </w:t>
+      </w:r>
+      <w:r>
+        <w:rPr>
+          <w:rFonts w:ascii="Arial" w:hAnsi="Arial" w:cs="Arial"/>
+          <w:b/>
+          <w:bCs/>
+          <w:noProof/>
+          <w:sz w:val="24"/>
+          <w:szCs w:val="24"/>
+          <w:lang w:val="en-CA"/>
+        </w:rPr>
+        <w:t xml:space="preserve">Event Volunteer </w:t>
+      </w:r>
+      <w:r>
+        <w:rPr>
+          <w:rFonts w:ascii="Arial" w:hAnsi="Arial" w:cs="Arial"/>
+          <w:b/>
+          <w:bCs/>
+          <w:noProof/>
+          <w:sz w:val="24"/>
+          <w:szCs w:val="24"/>
+          <w:lang w:val="en-CA"/>
+        </w:rPr>
+        <w:t xml:space="preserve">at </w:t>
+      </w:r>
+      <w:r>
+        <w:rPr>
+          <w:rFonts w:ascii="Arial" w:hAnsi="Arial" w:cs="Arial"/>
+          <w:b/>
+          <w:bCs/>
+          <w:noProof/>
+          <w:sz w:val="24"/>
+          <w:szCs w:val="24"/>
+          <w:lang w:val="en-CA"/>
+        </w:rPr>
+        <w:t>You @ Waterloo Day 2025</w:t>
+      </w:r>
+      <w:r>
+        <w:rPr>
+          <w:rFonts w:ascii="Arial" w:hAnsi="Arial" w:cs="Arial"/>
+          <w:b/>
+          <w:bCs/>
+          <w:noProof/>
+          <w:sz w:val="24"/>
+          <w:szCs w:val="24"/>
+          <w:lang w:val="en-CA"/>
+        </w:rPr>
+        <w:tab/>
+        <w:t xml:space="preserve">            </w:t>
+      </w:r>
+      <w:r>
+        <w:rPr>
+          <w:rFonts w:ascii="Arial" w:hAnsi="Arial" w:cs="Arial"/>
+          <w:b/>
+          <w:bCs/>
+          <w:noProof/>
+          <w:sz w:val="24"/>
+          <w:szCs w:val="24"/>
+          <w:lang w:val="en-CA"/>
+        </w:rPr>
+        <w:t>University of Waterloo</w:t>
+      </w:r>
+      <w:r>
+        <w:rPr>
+          <w:rFonts w:ascii="Arial" w:hAnsi="Arial" w:cs="Arial"/>
+          <w:b/>
+          <w:bCs/>
+          <w:noProof/>
+          <w:sz w:val="24"/>
+          <w:szCs w:val="24"/>
+          <w:lang w:val="en-CA"/>
+        </w:rPr>
+        <w:t>,ON</w:t>
+      </w:r>
+      <w:r>
+        <w:rPr>
+          <w:rFonts w:ascii="Arial" w:hAnsi="Arial" w:cs="Arial"/>
+          <w:b/>
+          <w:bCs/>
+          <w:noProof/>
+          <w:sz w:val="24"/>
+          <w:szCs w:val="24"/>
+          <w:lang w:val="en-CA"/>
+        </w:rPr>
+        <w:t>| May 2025</w:t>
+      </w:r>
+    </w:p>
+    <w:p>
+      <w:pPr>
+        <w:numPr>
+          <w:ilvl w:val="0"/>
+          <w:numId w:val="68"/>
+        </w:numPr>
+        <w:jc w:val="both"/>
+        <w:rPr>
+          <w:rFonts w:ascii="Arial" w:hAnsi="Arial" w:cs="Arial"/>
+          <w:noProof/>
+          <w:sz w:val="24"/>
+          <w:szCs w:val="24"/>
+          <w:lang w:val="en-CA"/>
+        </w:rPr>
+      </w:pPr>
+      <w:r>
+        <w:rPr>
+          <w:rFonts w:ascii="Arial" w:hAnsi="Arial" w:cs="Arial"/>
+          <w:noProof/>
+          <w:sz w:val="24"/>
+          <w:szCs w:val="24"/>
+          <w:lang w:val="en-CA"/>
+        </w:rPr>
+        <w:t>Assisted over 4,500 guests with directions, campus navigation, and event materials.</w:t>
+      </w:r>
+    </w:p>
+    <w:p>
+      <w:pPr>
+        <w:numPr>
+          <w:ilvl w:val="0"/>
+          <w:numId w:val="68"/>
+        </w:numPr>
+        <w:jc w:val="both"/>
+        <w:rPr>
+          <w:rFonts w:ascii="Arial" w:hAnsi="Arial" w:cs="Arial"/>
+          <w:noProof/>
+          <w:sz w:val="24"/>
+          <w:szCs w:val="24"/>
+          <w:lang w:val="en-CA"/>
+        </w:rPr>
+      </w:pPr>
+      <w:r>
+        <w:rPr>
+          <w:rFonts w:ascii="Arial" w:hAnsi="Arial" w:cs="Arial"/>
+          <w:noProof/>
+          <w:sz w:val="24"/>
+          <w:szCs w:val="24"/>
+          <w:lang w:val="en-CA"/>
+        </w:rPr>
+        <w:t>Ensured a smooth and welcoming experience for prospective students and their families.</w:t>
+      </w:r>
+    </w:p>
+    <w:p>
+      <w:pPr>
+        <w:jc w:val="both"/>
+        <w:rPr>
+          <w:rFonts w:ascii="Arial" w:hAnsi="Arial" w:cs="Arial"/>
           <w:iCs/>
           <w:position w:val="2"/>
           <w:sz w:val="24"/>
           <w:szCs w:val="24"/>
           <w:lang w:val="en-CA"/>
         </w:rPr>
-        <w:t>ing</w:t>
-      </w:r>
-      <w:r>
+      </w:pPr>
+    </w:p>
+    <w:p>
+      <w:pPr>
+        <w:jc w:val="both"/>
         <w:rPr>
           <w:rFonts w:ascii="Arial" w:hAnsi="Arial" w:cs="Arial"/>
           <w:b/>
@@ -4046,177 +4349,6 @@
           <w:szCs w:val="24"/>
           <w:lang w:val="en-CA"/>
         </w:rPr>
-        <w:br/>
-      </w:r>
-    </w:p>
-    <w:p>
-      <w:pPr>
-        <w:jc w:val="both"/>
-        <w:rPr>
-          <w:rFonts w:ascii="Arial" w:hAnsi="Arial" w:cs="Arial"/>
-          <w:b/>
-          <w:bCs/>
-          <w:iCs/>
-          <w:position w:val="2"/>
-          <w:sz w:val="24"/>
-          <w:szCs w:val="24"/>
-          <w:lang w:val="en-CA"/>
-        </w:rPr>
-      </w:pPr>
-      <w:r>
-        <w:rPr>
-          <w:rFonts w:ascii="Arial" w:hAnsi="Arial" w:cs="Arial"/>
-          <w:b/>
-          <w:bCs/>
-          <w:i/>
-          <w:iCs/>
-          <w:position w:val="2"/>
-          <w:sz w:val="24"/>
-          <w:szCs w:val="24"/>
-          <w:lang w:val="en-CA"/>
-        </w:rPr>
-        <w:t>You @ Waterloo Day 2025, University of Waterloo</w:t>
-      </w:r>
-      <w:r>
-        <w:rPr>
-          <w:rFonts w:ascii="Arial" w:hAnsi="Arial" w:cs="Arial"/>
-          <w:b/>
-          <w:bCs/>
-          <w:iCs/>
-          <w:position w:val="2"/>
-          <w:sz w:val="24"/>
-          <w:szCs w:val="24"/>
-          <w:lang w:val="en-CA"/>
-        </w:rPr>
-        <w:t xml:space="preserve"> | </w:t>
-      </w:r>
-      <w:r>
-        <w:rPr>
-          <w:rFonts w:ascii="Arial" w:hAnsi="Arial" w:cs="Arial"/>
-          <w:b/>
-          <w:bCs/>
-          <w:iCs/>
-          <w:position w:val="2"/>
-          <w:sz w:val="24"/>
-          <w:szCs w:val="24"/>
-          <w:lang w:val="en-CA"/>
-        </w:rPr>
-        <w:t>May 2025</w:t>
-      </w:r>
-    </w:p>
-    <w:p>
-      <w:pPr>
-        <w:pStyle w:val="ListParagraph"/>
-        <w:numPr>
-          <w:ilvl w:val="0"/>
-          <w:numId w:val="17"/>
-        </w:numPr>
-        <w:jc w:val="both"/>
-        <w:rPr>
-          <w:rFonts w:ascii="Arial" w:hAnsi="Arial" w:cs="Arial"/>
-          <w:iCs/>
-          <w:position w:val="2"/>
-          <w:sz w:val="24"/>
-          <w:szCs w:val="24"/>
-          <w:lang w:val="en-CA"/>
-        </w:rPr>
-      </w:pPr>
-      <w:r>
-        <w:rPr>
-          <w:rFonts w:ascii="Arial" w:hAnsi="Arial" w:cs="Arial"/>
-          <w:iCs/>
-          <w:position w:val="2"/>
-          <w:sz w:val="24"/>
-          <w:szCs w:val="24"/>
-          <w:lang w:val="en-CA"/>
-        </w:rPr>
-        <w:t>Assisted over 4,500 prospective students and families with directions and event materials</w:t>
-      </w:r>
-    </w:p>
-    <w:p>
-      <w:pPr>
-        <w:pStyle w:val="ListParagraph"/>
-        <w:numPr>
-          <w:ilvl w:val="0"/>
-          <w:numId w:val="17"/>
-        </w:numPr>
-        <w:jc w:val="both"/>
-        <w:rPr>
-          <w:rFonts w:ascii="Arial" w:hAnsi="Arial" w:cs="Arial"/>
-          <w:iCs/>
-          <w:position w:val="2"/>
-          <w:sz w:val="24"/>
-          <w:szCs w:val="24"/>
-          <w:lang w:val="en-CA"/>
-        </w:rPr>
-      </w:pPr>
-      <w:r>
-        <w:rPr>
-          <w:rFonts w:ascii="Arial" w:hAnsi="Arial" w:cs="Arial"/>
-          <w:iCs/>
-          <w:position w:val="2"/>
-          <w:sz w:val="24"/>
-          <w:szCs w:val="24"/>
-          <w:lang w:val="en-CA"/>
-        </w:rPr>
-        <w:t>Supported campus tours and wayfinding to enhance visitor experience</w:t>
-      </w:r>
-    </w:p>
-    <w:p>
-      <w:pPr>
-        <w:pStyle w:val="ListParagraph"/>
-        <w:numPr>
-          <w:ilvl w:val="0"/>
-          <w:numId w:val="17"/>
-        </w:numPr>
-        <w:jc w:val="both"/>
-        <w:rPr>
-          <w:rFonts w:ascii="Arial" w:hAnsi="Arial" w:cs="Arial"/>
-          <w:iCs/>
-          <w:position w:val="2"/>
-          <w:sz w:val="24"/>
-          <w:szCs w:val="24"/>
-          <w:lang w:val="en-CA"/>
-        </w:rPr>
-      </w:pPr>
-      <w:r>
-        <w:rPr>
-          <w:rFonts w:ascii="Arial" w:hAnsi="Arial" w:cs="Arial"/>
-          <w:iCs/>
-          <w:position w:val="2"/>
-          <w:sz w:val="24"/>
-          <w:szCs w:val="24"/>
-          <w:lang w:val="en-CA"/>
-        </w:rPr>
-        <w:t>Collaborated with staff and volunteers to ensure a welcoming and safe event environment</w:t>
-      </w:r>
-    </w:p>
-    <w:p>
-      <w:pPr>
-        <w:jc w:val="both"/>
-        <w:rPr>
-          <w:rFonts w:ascii="Arial" w:hAnsi="Arial" w:cs="Arial"/>
-          <w:iCs/>
-          <w:position w:val="2"/>
-          <w:sz w:val="24"/>
-          <w:szCs w:val="24"/>
-          <w:lang w:val="en-CA"/>
-        </w:rPr>
-      </w:pPr>
-    </w:p>
-    <w:p>
-      <w:pPr>
-        <w:jc w:val="both"/>
-        <w:rPr>
-          <w:rFonts w:ascii="Arial" w:hAnsi="Arial" w:cs="Arial"/>
-          <w:b/>
-          <w:bCs/>
-          <w:iCs/>
-          <w:position w:val="2"/>
-          <w:sz w:val="24"/>
-          <w:szCs w:val="24"/>
-          <w:lang w:val="en-CA"/>
-        </w:rPr>
       </w:pPr>
       <w:r>
         <w:rPr>
@@ -4227,7 +4359,6 @@
           <w:sz w:val="24"/>
           <w:szCs w:val="24"/>
         </w:rPr>
-        <w:lastRenderedPageBreak/>
         <mc:AlternateContent>
           <mc:Choice Requires="wps">
             <w:drawing>
@@ -4295,7 +4426,7 @@
           </mc:Choice>
           <mc:Fallback>
             <w:pict>
-              <v:shape w14:anchorId="04B5C4A2" id="Graphic 8" o:spid="_x0000_s1026" style="position:absolute;margin-left:34.2pt;margin-top:17.4pt;width:540pt;height:.1pt;z-index:251817984;visibility:visible;mso-wrap-style:square;mso-wrap-distance-left:0;mso-wrap-distance-top:0;mso-wrap-distance-right:0;mso-wrap-distance-bottom:0;mso-position-horizontal:absolute;mso-position-horizontal-relative:page;mso-position-vertical:absolute;mso-position-vertical-relative:text;v-text-anchor:top" coordsize="6858000,1270" o:gfxdata="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" path="m,l6858000,e" filled="f" strokeweight=".14039mm">
+              <v:shape w14:anchorId="74F44955" id="Graphic 8" o:spid="_x0000_s1026" style="position:absolute;margin-left:34.2pt;margin-top:17.4pt;width:540pt;height:.1pt;z-index:251817984;visibility:visible;mso-wrap-style:square;mso-wrap-distance-left:0;mso-wrap-distance-top:0;mso-wrap-distance-right:0;mso-wrap-distance-bottom:0;mso-position-horizontal:absolute;mso-position-horizontal-relative:page;mso-position-vertical:absolute;mso-position-vertical-relative:text;v-text-anchor:top" coordsize="6858000,1270" o:gfxdata="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" path="m,l6858000,e" filled="f" strokeweight=".14039mm">
                 <v:path arrowok="t"/>
                 <w10:wrap anchorx="page"/>
               </v:shape>
@@ -4508,7 +4639,7 @@
           </mc:Choice>
           <mc:Fallback>
             <w:pict>
-              <v:shape w14:anchorId="389496B0" id="Graphic 8" o:spid="_x0000_s1026" style="position:absolute;margin-left:34.2pt;margin-top:1.8pt;width:540pt;height:.1pt;z-index:251823104;visibility:visible;mso-wrap-style:square;mso-wrap-distance-left:0;mso-wrap-distance-top:0;mso-wrap-distance-right:0;mso-wrap-distance-bottom:0;mso-position-horizontal:absolute;mso-position-horizontal-relative:page;mso-position-vertical:absolute;mso-position-vertical-relative:text;v-text-anchor:top" coordsize="6858000,1270" o:gfxdata="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" path="m,l6858000,e" filled="f" strokeweight=".14039mm">
+              <v:shape w14:anchorId="67489734" id="Graphic 8" o:spid="_x0000_s1026" style="position:absolute;margin-left:34.2pt;margin-top:1.8pt;width:540pt;height:.1pt;z-index:251823104;visibility:visible;mso-wrap-style:square;mso-wrap-distance-left:0;mso-wrap-distance-top:0;mso-wrap-distance-right:0;mso-wrap-distance-bottom:0;mso-position-horizontal:absolute;mso-position-horizontal-relative:page;mso-position-vertical:absolute;mso-position-vertical-relative:text;v-text-anchor:top" coordsize="6858000,1270" o:gfxdata="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" path="m,l6858000,e" filled="f" strokeweight=".14039mm">
                 <v:path arrowok="t"/>
                 <w10:wrap anchorx="page"/>
               </v:shape>
@@ -4716,6 +4847,118 @@
     </w:lvl>
   </w:abstractNum>
   <w:abstractNum w:abstractNumId="1" w15:restartNumberingAfterBreak="0">
+    <w:nsid w:val="076A1450"/>
+    <w:multiLevelType w:val="hybridMultilevel"/>
+    <w:tmpl w:val="D71493F0"/>
+    <w:lvl w:ilvl="0" w:tplc="0E040E4A">
+      <w:numFmt w:val="bullet"/>
+      <w:lvlText w:val="•"/>
+      <w:lvlJc w:val="left"/>
+      <w:pPr>
+        <w:ind w:left="1080" w:hanging="360"/>
+      </w:pPr>
+      <w:rPr>
+        <w:lang w:val="en-US" w:eastAsia="en-US" w:bidi="ar-SA"/>
+      </w:rPr>
+    </w:lvl>
+    <w:lvl w:ilvl="1" w:tplc="10090003">
+      <w:start w:val="1"/>
+      <w:numFmt w:val="bullet"/>
+      <w:lvlText w:val="o"/>
+      <w:lvlJc w:val="left"/>
+      <w:pPr>
+        <w:ind w:left="1800" w:hanging="360"/>
+      </w:pPr>
+      <w:rPr>
+        <w:rFonts w:ascii="Courier New" w:hAnsi="Courier New" w:cs="Courier New" w:hint="default"/>
+      </w:rPr>
+    </w:lvl>
+    <w:lvl w:ilvl="2" w:tplc="10090005">
+      <w:start w:val="1"/>
+      <w:numFmt w:val="bullet"/>
+      <w:lvlText w:val=""/>
+      <w:lvlJc w:val="left"/>
+      <w:pPr>
+        <w:ind w:left="2520" w:hanging="360"/>
+      </w:pPr>
+      <w:rPr>
+        <w:rFonts w:ascii="Wingdings" w:hAnsi="Wingdings" w:hint="default"/>
+      </w:rPr>
+    </w:lvl>
+    <w:lvl w:ilvl="3" w:tplc="10090001">
+      <w:start w:val="1"/>
+      <w:numFmt w:val="bullet"/>
+      <w:lvlText w:val=""/>
+      <w:lvlJc w:val="left"/>
+      <w:pPr>
+        <w:ind w:left="3240" w:hanging="360"/>
+      </w:pPr>
+      <w:rPr>
+        <w:rFonts w:ascii="Symbol" w:hAnsi="Symbol" w:hint="default"/>
+      </w:rPr>
+    </w:lvl>
+    <w:lvl w:ilvl="4" w:tplc="10090003">
+      <w:start w:val="1"/>
+      <w:numFmt w:val="bullet"/>
+      <w:lvlText w:val="o"/>
+      <w:lvlJc w:val="left"/>
+      <w:pPr>
+        <w:ind w:left="3960" w:hanging="360"/>
+      </w:pPr>
+      <w:rPr>
+        <w:rFonts w:ascii="Courier New" w:hAnsi="Courier New" w:cs="Courier New" w:hint="default"/>
+      </w:rPr>
+    </w:lvl>
+    <w:lvl w:ilvl="5" w:tplc="10090005">
+      <w:start w:val="1"/>
+      <w:numFmt w:val="bullet"/>
+      <w:lvlText w:val=""/>
+      <w:lvlJc w:val="left"/>
+      <w:pPr>
+        <w:ind w:left="4680" w:hanging="360"/>
+      </w:pPr>
+      <w:rPr>
+        <w:rFonts w:ascii="Wingdings" w:hAnsi="Wingdings" w:hint="default"/>
+      </w:rPr>
+    </w:lvl>
+    <w:lvl w:ilvl="6" w:tplc="10090001">
+      <w:start w:val="1"/>
+      <w:numFmt w:val="bullet"/>
+      <w:lvlText w:val=""/>
+      <w:lvlJc w:val="left"/>
+      <w:pPr>
+        <w:ind w:left="5400" w:hanging="360"/>
+      </w:pPr>
+      <w:rPr>
+        <w:rFonts w:ascii="Symbol" w:hAnsi="Symbol" w:hint="default"/>
+      </w:rPr>
+    </w:lvl>
+    <w:lvl w:ilvl="7" w:tplc="10090003">
+      <w:start w:val="1"/>
+      <w:numFmt w:val="bullet"/>
+      <w:lvlText w:val="o"/>
+      <w:lvlJc w:val="left"/>
+      <w:pPr>
+        <w:ind w:left="6120" w:hanging="360"/>
+      </w:pPr>
+      <w:rPr>
+        <w:rFonts w:ascii="Courier New" w:hAnsi="Courier New" w:cs="Courier New" w:hint="default"/>
+      </w:rPr>
+    </w:lvl>
+    <w:lvl w:ilvl="8" w:tplc="10090005">
+      <w:start w:val="1"/>
+      <w:numFmt w:val="bullet"/>
+      <w:lvlText w:val=""/>
+      <w:lvlJc w:val="left"/>
+      <w:pPr>
+        <w:ind w:left="6840" w:hanging="360"/>
+      </w:pPr>
+      <w:rPr>
+        <w:rFonts w:ascii="Wingdings" w:hAnsi="Wingdings" w:hint="default"/>
+      </w:rPr>
+    </w:lvl>
+  </w:abstractNum>
+  <w:abstractNum w:abstractNumId="2" w15:restartNumberingAfterBreak="0">
     <w:nsid w:val="08246C4C"/>
     <w:multiLevelType w:val="hybridMultilevel"/>
     <w:tmpl w:val="FB605E5A"/>
@@ -4828,7 +5071,7 @@
       </w:rPr>
     </w:lvl>
   </w:abstractNum>
-  <w:abstractNum w:abstractNumId="2" w15:restartNumberingAfterBreak="0">
+  <w:abstractNum w:abstractNumId="3" w15:restartNumberingAfterBreak="0">
     <w:nsid w:val="0A922ED7"/>
     <w:multiLevelType w:val="multilevel"/>
     <w:tmpl w:val="62E4331A"/>
@@ -4977,7 +5220,119 @@
       </w:rPr>
     </w:lvl>
   </w:abstractNum>
-  <w:abstractNum w:abstractNumId="3" w15:restartNumberingAfterBreak="0">
+  <w:abstractNum w:abstractNumId="4" w15:restartNumberingAfterBreak="0">
+    <w:nsid w:val="0AC27251"/>
+    <w:multiLevelType w:val="hybridMultilevel"/>
+    <w:tmpl w:val="AD8E92A6"/>
+    <w:lvl w:ilvl="0" w:tplc="0E040E4A">
+      <w:numFmt w:val="bullet"/>
+      <w:lvlText w:val="•"/>
+      <w:lvlJc w:val="left"/>
+      <w:pPr>
+        <w:ind w:left="720" w:hanging="360"/>
+      </w:pPr>
+      <w:rPr>
+        <w:lang w:val="en-US" w:eastAsia="en-US" w:bidi="ar-SA"/>
+      </w:rPr>
+    </w:lvl>
+    <w:lvl w:ilvl="1" w:tplc="10090003">
+      <w:start w:val="1"/>
+      <w:numFmt w:val="bullet"/>
+      <w:lvlText w:val="o"/>
+      <w:lvlJc w:val="left"/>
+      <w:pPr>
+        <w:ind w:left="1440" w:hanging="360"/>
+      </w:pPr>
+      <w:rPr>
+        <w:rFonts w:ascii="Courier New" w:hAnsi="Courier New" w:cs="Courier New" w:hint="default"/>
+      </w:rPr>
+    </w:lvl>
+    <w:lvl w:ilvl="2" w:tplc="10090005">
+      <w:start w:val="1"/>
+      <w:numFmt w:val="bullet"/>
+      <w:lvlText w:val=""/>
+      <w:lvlJc w:val="left"/>
+      <w:pPr>
+        <w:ind w:left="2160" w:hanging="360"/>
+      </w:pPr>
+      <w:rPr>
+        <w:rFonts w:ascii="Wingdings" w:hAnsi="Wingdings" w:hint="default"/>
+      </w:rPr>
+    </w:lvl>
+    <w:lvl w:ilvl="3" w:tplc="10090001">
+      <w:start w:val="1"/>
+      <w:numFmt w:val="bullet"/>
+      <w:lvlText w:val=""/>
+      <w:lvlJc w:val="left"/>
+      <w:pPr>
+        <w:ind w:left="2880" w:hanging="360"/>
+      </w:pPr>
+      <w:rPr>
+        <w:rFonts w:ascii="Symbol" w:hAnsi="Symbol" w:hint="default"/>
+      </w:rPr>
+    </w:lvl>
+    <w:lvl w:ilvl="4" w:tplc="10090003">
+      <w:start w:val="1"/>
+      <w:numFmt w:val="bullet"/>
+      <w:lvlText w:val="o"/>
+      <w:lvlJc w:val="left"/>
+      <w:pPr>
+        <w:ind w:left="3600" w:hanging="360"/>
+      </w:pPr>
+      <w:rPr>
+        <w:rFonts w:ascii="Courier New" w:hAnsi="Courier New" w:cs="Courier New" w:hint="default"/>
+      </w:rPr>
+    </w:lvl>
+    <w:lvl w:ilvl="5" w:tplc="10090005">
+      <w:start w:val="1"/>
+      <w:numFmt w:val="bullet"/>
+      <w:lvlText w:val=""/>
+      <w:lvlJc w:val="left"/>
+      <w:pPr>
+        <w:ind w:left="4320" w:hanging="360"/>
+      </w:pPr>
+      <w:rPr>
+        <w:rFonts w:ascii="Wingdings" w:hAnsi="Wingdings" w:hint="default"/>
+      </w:rPr>
+    </w:lvl>
+    <w:lvl w:ilvl="6" w:tplc="10090001">
+      <w:start w:val="1"/>
+      <w:numFmt w:val="bullet"/>
+      <w:lvlText w:val=""/>
+      <w:lvlJc w:val="left"/>
+      <w:pPr>
+        <w:ind w:left="5040" w:hanging="360"/>
+      </w:pPr>
+      <w:rPr>
+        <w:rFonts w:ascii="Symbol" w:hAnsi="Symbol" w:hint="default"/>
+      </w:rPr>
+    </w:lvl>
+    <w:lvl w:ilvl="7" w:tplc="10090003">
+      <w:start w:val="1"/>
+      <w:numFmt w:val="bullet"/>
+      <w:lvlText w:val="o"/>
+      <w:lvlJc w:val="left"/>
+      <w:pPr>
+        <w:ind w:left="5760" w:hanging="360"/>
+      </w:pPr>
+      <w:rPr>
+        <w:rFonts w:ascii="Courier New" w:hAnsi="Courier New" w:cs="Courier New" w:hint="default"/>
+      </w:rPr>
+    </w:lvl>
+    <w:lvl w:ilvl="8" w:tplc="10090005">
+      <w:start w:val="1"/>
+      <w:numFmt w:val="bullet"/>
+      <w:lvlText w:val=""/>
+      <w:lvlJc w:val="left"/>
+      <w:pPr>
+        <w:ind w:left="6480" w:hanging="360"/>
+      </w:pPr>
+      <w:rPr>
+        <w:rFonts w:ascii="Wingdings" w:hAnsi="Wingdings" w:hint="default"/>
+      </w:rPr>
+    </w:lvl>
+  </w:abstractNum>
+  <w:abstractNum w:abstractNumId="5" w15:restartNumberingAfterBreak="0">
     <w:nsid w:val="0B3D4B60"/>
     <w:multiLevelType w:val="hybridMultilevel"/>
     <w:tmpl w:val="D0EA6134"/>
@@ -5090,7 +5445,7 @@
       </w:rPr>
     </w:lvl>
   </w:abstractNum>
-  <w:abstractNum w:abstractNumId="4" w15:restartNumberingAfterBreak="0">
+  <w:abstractNum w:abstractNumId="6" w15:restartNumberingAfterBreak="0">
     <w:nsid w:val="0C2924DD"/>
     <w:multiLevelType w:val="multilevel"/>
     <w:tmpl w:val="B906C306"/>
@@ -5239,7 +5594,7 @@
       </w:rPr>
     </w:lvl>
   </w:abstractNum>
-  <w:abstractNum w:abstractNumId="5" w15:restartNumberingAfterBreak="0">
+  <w:abstractNum w:abstractNumId="7" w15:restartNumberingAfterBreak="0">
     <w:nsid w:val="0D5A663C"/>
     <w:multiLevelType w:val="hybridMultilevel"/>
     <w:tmpl w:val="8C70146A"/>
@@ -5352,7 +5707,7 @@
       </w:rPr>
     </w:lvl>
   </w:abstractNum>
-  <w:abstractNum w:abstractNumId="6" w15:restartNumberingAfterBreak="0">
+  <w:abstractNum w:abstractNumId="8" w15:restartNumberingAfterBreak="0">
     <w:nsid w:val="0D912F7B"/>
     <w:multiLevelType w:val="hybridMultilevel"/>
     <w:tmpl w:val="8B5CA8B4"/>
@@ -5465,7 +5820,7 @@
       </w:rPr>
     </w:lvl>
   </w:abstractNum>
-  <w:abstractNum w:abstractNumId="7" w15:restartNumberingAfterBreak="0">
+  <w:abstractNum w:abstractNumId="9" w15:restartNumberingAfterBreak="0">
     <w:nsid w:val="0DD67D87"/>
     <w:multiLevelType w:val="hybridMultilevel"/>
     <w:tmpl w:val="F070903A"/>
@@ -5578,7 +5933,7 @@
       </w:rPr>
     </w:lvl>
   </w:abstractNum>
-  <w:abstractNum w:abstractNumId="8" w15:restartNumberingAfterBreak="0">
+  <w:abstractNum w:abstractNumId="10" w15:restartNumberingAfterBreak="0">
     <w:nsid w:val="0F2D7546"/>
     <w:multiLevelType w:val="multilevel"/>
     <w:tmpl w:val="BCB28130"/>
@@ -5727,7 +6082,7 @@
       </w:rPr>
     </w:lvl>
   </w:abstractNum>
-  <w:abstractNum w:abstractNumId="9" w15:restartNumberingAfterBreak="0">
+  <w:abstractNum w:abstractNumId="11" w15:restartNumberingAfterBreak="0">
     <w:nsid w:val="108D3235"/>
     <w:multiLevelType w:val="multilevel"/>
     <w:tmpl w:val="9BDE0F80"/>
@@ -5876,7 +6231,7 @@
       </w:rPr>
     </w:lvl>
   </w:abstractNum>
-  <w:abstractNum w:abstractNumId="10" w15:restartNumberingAfterBreak="0">
+  <w:abstractNum w:abstractNumId="12" w15:restartNumberingAfterBreak="0">
     <w:nsid w:val="11F17838"/>
     <w:multiLevelType w:val="hybridMultilevel"/>
     <w:tmpl w:val="8676ECDE"/>
@@ -5989,7 +6344,7 @@
       </w:rPr>
     </w:lvl>
   </w:abstractNum>
-  <w:abstractNum w:abstractNumId="11" w15:restartNumberingAfterBreak="0">
+  <w:abstractNum w:abstractNumId="13" w15:restartNumberingAfterBreak="0">
     <w:nsid w:val="1258635E"/>
     <w:multiLevelType w:val="multilevel"/>
     <w:tmpl w:val="C6E8512E"/>
@@ -6138,7 +6493,7 @@
       </w:rPr>
     </w:lvl>
   </w:abstractNum>
-  <w:abstractNum w:abstractNumId="12" w15:restartNumberingAfterBreak="0">
+  <w:abstractNum w:abstractNumId="14" w15:restartNumberingAfterBreak="0">
     <w:nsid w:val="15330246"/>
     <w:multiLevelType w:val="hybridMultilevel"/>
     <w:tmpl w:val="70DC2C46"/>
@@ -6250,7 +6605,7 @@
       </w:rPr>
     </w:lvl>
   </w:abstractNum>
-  <w:abstractNum w:abstractNumId="13" w15:restartNumberingAfterBreak="0">
+  <w:abstractNum w:abstractNumId="15" w15:restartNumberingAfterBreak="0">
     <w:nsid w:val="16294F88"/>
     <w:multiLevelType w:val="hybridMultilevel"/>
     <w:tmpl w:val="AD8686A0"/>
@@ -6363,7 +6718,7 @@
       </w:rPr>
     </w:lvl>
   </w:abstractNum>
-  <w:abstractNum w:abstractNumId="14" w15:restartNumberingAfterBreak="0">
+  <w:abstractNum w:abstractNumId="16" w15:restartNumberingAfterBreak="0">
     <w:nsid w:val="178757F6"/>
     <w:multiLevelType w:val="multilevel"/>
     <w:tmpl w:val="8EEC6C6C"/>
@@ -6512,7 +6867,7 @@
       </w:rPr>
     </w:lvl>
   </w:abstractNum>
-  <w:abstractNum w:abstractNumId="15" w15:restartNumberingAfterBreak="0">
+  <w:abstractNum w:abstractNumId="17" w15:restartNumberingAfterBreak="0">
     <w:nsid w:val="181923F6"/>
     <w:multiLevelType w:val="hybridMultilevel"/>
     <w:tmpl w:val="A0543542"/>
@@ -6624,7 +6979,7 @@
       </w:rPr>
     </w:lvl>
   </w:abstractNum>
-  <w:abstractNum w:abstractNumId="16" w15:restartNumberingAfterBreak="0">
+  <w:abstractNum w:abstractNumId="18" w15:restartNumberingAfterBreak="0">
     <w:nsid w:val="19423D6B"/>
     <w:multiLevelType w:val="hybridMultilevel"/>
     <w:tmpl w:val="A7D2A0AA"/>
@@ -6736,7 +7091,7 @@
       </w:rPr>
     </w:lvl>
   </w:abstractNum>
-  <w:abstractNum w:abstractNumId="17" w15:restartNumberingAfterBreak="0">
+  <w:abstractNum w:abstractNumId="19" w15:restartNumberingAfterBreak="0">
     <w:nsid w:val="19865446"/>
     <w:multiLevelType w:val="hybridMultilevel"/>
     <w:tmpl w:val="844CB87E"/>
@@ -6849,7 +7204,7 @@
       </w:rPr>
     </w:lvl>
   </w:abstractNum>
-  <w:abstractNum w:abstractNumId="18" w15:restartNumberingAfterBreak="0">
+  <w:abstractNum w:abstractNumId="20" w15:restartNumberingAfterBreak="0">
     <w:nsid w:val="19B568F9"/>
     <w:multiLevelType w:val="hybridMultilevel"/>
     <w:tmpl w:val="B66262CC"/>
@@ -6961,7 +7316,7 @@
       </w:rPr>
     </w:lvl>
   </w:abstractNum>
-  <w:abstractNum w:abstractNumId="19" w15:restartNumberingAfterBreak="0">
+  <w:abstractNum w:abstractNumId="21" w15:restartNumberingAfterBreak="0">
     <w:nsid w:val="200B04BE"/>
     <w:multiLevelType w:val="hybridMultilevel"/>
     <w:tmpl w:val="4E6E53BE"/>
@@ -7074,7 +7429,7 @@
       </w:rPr>
     </w:lvl>
   </w:abstractNum>
-  <w:abstractNum w:abstractNumId="20" w15:restartNumberingAfterBreak="0">
+  <w:abstractNum w:abstractNumId="22" w15:restartNumberingAfterBreak="0">
     <w:nsid w:val="220F42D2"/>
     <w:multiLevelType w:val="multilevel"/>
     <w:tmpl w:val="59765C9E"/>
@@ -7223,7 +7578,7 @@
       </w:rPr>
     </w:lvl>
   </w:abstractNum>
-  <w:abstractNum w:abstractNumId="21" w15:restartNumberingAfterBreak="0">
+  <w:abstractNum w:abstractNumId="23" w15:restartNumberingAfterBreak="0">
     <w:nsid w:val="241566FB"/>
     <w:multiLevelType w:val="multilevel"/>
     <w:tmpl w:val="CC14C5E0"/>
@@ -7372,7 +7727,7 @@
       </w:rPr>
     </w:lvl>
   </w:abstractNum>
-  <w:abstractNum w:abstractNumId="22" w15:restartNumberingAfterBreak="0">
+  <w:abstractNum w:abstractNumId="24" w15:restartNumberingAfterBreak="0">
     <w:nsid w:val="25B9673D"/>
     <w:multiLevelType w:val="multilevel"/>
     <w:tmpl w:val="C914BB44"/>
@@ -7521,7 +7876,7 @@
       </w:rPr>
     </w:lvl>
   </w:abstractNum>
-  <w:abstractNum w:abstractNumId="23" w15:restartNumberingAfterBreak="0">
+  <w:abstractNum w:abstractNumId="25" w15:restartNumberingAfterBreak="0">
     <w:nsid w:val="29653F35"/>
     <w:multiLevelType w:val="multilevel"/>
     <w:tmpl w:val="1DF48820"/>
@@ -7670,7 +8025,7 @@
       </w:rPr>
     </w:lvl>
   </w:abstractNum>
-  <w:abstractNum w:abstractNumId="24" w15:restartNumberingAfterBreak="0">
+  <w:abstractNum w:abstractNumId="26" w15:restartNumberingAfterBreak="0">
     <w:nsid w:val="2A0E1A0C"/>
     <w:multiLevelType w:val="multilevel"/>
     <w:tmpl w:val="D08E9378"/>
@@ -7819,7 +8174,7 @@
       </w:rPr>
     </w:lvl>
   </w:abstractNum>
-  <w:abstractNum w:abstractNumId="25" w15:restartNumberingAfterBreak="0">
+  <w:abstractNum w:abstractNumId="27" w15:restartNumberingAfterBreak="0">
     <w:nsid w:val="2A4C60C3"/>
     <w:multiLevelType w:val="hybridMultilevel"/>
     <w:tmpl w:val="D59097DE"/>
@@ -7932,7 +8287,7 @@
       </w:rPr>
     </w:lvl>
   </w:abstractNum>
-  <w:abstractNum w:abstractNumId="26" w15:restartNumberingAfterBreak="0">
+  <w:abstractNum w:abstractNumId="28" w15:restartNumberingAfterBreak="0">
     <w:nsid w:val="2AEB347B"/>
     <w:multiLevelType w:val="hybridMultilevel"/>
     <w:tmpl w:val="1194AFB4"/>
@@ -8045,7 +8400,7 @@
       </w:rPr>
     </w:lvl>
   </w:abstractNum>
-  <w:abstractNum w:abstractNumId="27" w15:restartNumberingAfterBreak="0">
+  <w:abstractNum w:abstractNumId="29" w15:restartNumberingAfterBreak="0">
     <w:nsid w:val="30585C69"/>
     <w:multiLevelType w:val="hybridMultilevel"/>
     <w:tmpl w:val="D5687BB2"/>
@@ -8157,7 +8512,7 @@
       </w:rPr>
     </w:lvl>
   </w:abstractNum>
-  <w:abstractNum w:abstractNumId="28" w15:restartNumberingAfterBreak="0">
+  <w:abstractNum w:abstractNumId="30" w15:restartNumberingAfterBreak="0">
     <w:nsid w:val="31473168"/>
     <w:multiLevelType w:val="hybridMultilevel"/>
     <w:tmpl w:val="D55821EC"/>
@@ -8270,7 +8625,7 @@
       </w:rPr>
     </w:lvl>
   </w:abstractNum>
-  <w:abstractNum w:abstractNumId="29" w15:restartNumberingAfterBreak="0">
+  <w:abstractNum w:abstractNumId="31" w15:restartNumberingAfterBreak="0">
     <w:nsid w:val="35C45660"/>
     <w:multiLevelType w:val="hybridMultilevel"/>
     <w:tmpl w:val="62945678"/>
@@ -8382,7 +8737,7 @@
       </w:rPr>
     </w:lvl>
   </w:abstractNum>
-  <w:abstractNum w:abstractNumId="30" w15:restartNumberingAfterBreak="0">
+  <w:abstractNum w:abstractNumId="32" w15:restartNumberingAfterBreak="0">
     <w:nsid w:val="3C1D657B"/>
     <w:multiLevelType w:val="hybridMultilevel"/>
     <w:tmpl w:val="F95828FC"/>
@@ -8495,7 +8850,7 @@
       </w:rPr>
     </w:lvl>
   </w:abstractNum>
-  <w:abstractNum w:abstractNumId="31" w15:restartNumberingAfterBreak="0">
+  <w:abstractNum w:abstractNumId="33" w15:restartNumberingAfterBreak="0">
     <w:nsid w:val="3CA30A28"/>
     <w:multiLevelType w:val="hybridMultilevel"/>
     <w:tmpl w:val="C42A22A0"/>
@@ -8608,7 +8963,7 @@
       </w:rPr>
     </w:lvl>
   </w:abstractNum>
-  <w:abstractNum w:abstractNumId="32" w15:restartNumberingAfterBreak="0">
+  <w:abstractNum w:abstractNumId="34" w15:restartNumberingAfterBreak="0">
     <w:nsid w:val="3D203DF7"/>
     <w:multiLevelType w:val="hybridMultilevel"/>
     <w:tmpl w:val="C38EA338"/>
@@ -8721,7 +9076,7 @@
       </w:rPr>
     </w:lvl>
   </w:abstractNum>
-  <w:abstractNum w:abstractNumId="33" w15:restartNumberingAfterBreak="0">
+  <w:abstractNum w:abstractNumId="35" w15:restartNumberingAfterBreak="0">
     <w:nsid w:val="3F055DE7"/>
     <w:multiLevelType w:val="hybridMultilevel"/>
     <w:tmpl w:val="83A0123E"/>
@@ -8834,7 +9189,7 @@
       </w:rPr>
     </w:lvl>
   </w:abstractNum>
-  <w:abstractNum w:abstractNumId="34" w15:restartNumberingAfterBreak="0">
+  <w:abstractNum w:abstractNumId="36" w15:restartNumberingAfterBreak="0">
     <w:nsid w:val="40B47006"/>
     <w:multiLevelType w:val="hybridMultilevel"/>
     <w:tmpl w:val="A89E6A96"/>
@@ -8949,7 +9304,7 @@
       </w:rPr>
     </w:lvl>
   </w:abstractNum>
-  <w:abstractNum w:abstractNumId="35" w15:restartNumberingAfterBreak="0">
+  <w:abstractNum w:abstractNumId="37" w15:restartNumberingAfterBreak="0">
     <w:nsid w:val="46EB6697"/>
     <w:multiLevelType w:val="multilevel"/>
     <w:tmpl w:val="10087206"/>
@@ -9098,7 +9453,7 @@
       </w:rPr>
     </w:lvl>
   </w:abstractNum>
-  <w:abstractNum w:abstractNumId="36" w15:restartNumberingAfterBreak="0">
+  <w:abstractNum w:abstractNumId="38" w15:restartNumberingAfterBreak="0">
     <w:nsid w:val="47166283"/>
     <w:multiLevelType w:val="hybridMultilevel"/>
     <w:tmpl w:val="1FA43438"/>
@@ -9211,7 +9566,7 @@
       </w:rPr>
     </w:lvl>
   </w:abstractNum>
-  <w:abstractNum w:abstractNumId="37" w15:restartNumberingAfterBreak="0">
+  <w:abstractNum w:abstractNumId="39" w15:restartNumberingAfterBreak="0">
     <w:nsid w:val="491456CE"/>
     <w:multiLevelType w:val="hybridMultilevel"/>
     <w:tmpl w:val="EA6A9E36"/>
@@ -9324,7 +9679,7 @@
       </w:rPr>
     </w:lvl>
   </w:abstractNum>
-  <w:abstractNum w:abstractNumId="38" w15:restartNumberingAfterBreak="0">
+  <w:abstractNum w:abstractNumId="40" w15:restartNumberingAfterBreak="0">
     <w:nsid w:val="49E50923"/>
     <w:multiLevelType w:val="hybridMultilevel"/>
     <w:tmpl w:val="BEE850F4"/>
@@ -9437,7 +9792,7 @@
       </w:rPr>
     </w:lvl>
   </w:abstractNum>
-  <w:abstractNum w:abstractNumId="39" w15:restartNumberingAfterBreak="0">
+  <w:abstractNum w:abstractNumId="41" w15:restartNumberingAfterBreak="0">
     <w:nsid w:val="4BD327CB"/>
     <w:multiLevelType w:val="hybridMultilevel"/>
     <w:tmpl w:val="88C80BF4"/>
@@ -9550,7 +9905,7 @@
       </w:rPr>
     </w:lvl>
   </w:abstractNum>
-  <w:abstractNum w:abstractNumId="40" w15:restartNumberingAfterBreak="0">
+  <w:abstractNum w:abstractNumId="42" w15:restartNumberingAfterBreak="0">
     <w:nsid w:val="4D684866"/>
     <w:multiLevelType w:val="multilevel"/>
     <w:tmpl w:val="579A0D34"/>
@@ -9699,7 +10054,7 @@
       </w:rPr>
     </w:lvl>
   </w:abstractNum>
-  <w:abstractNum w:abstractNumId="41" w15:restartNumberingAfterBreak="0">
+  <w:abstractNum w:abstractNumId="43" w15:restartNumberingAfterBreak="0">
     <w:nsid w:val="4DE933F3"/>
     <w:multiLevelType w:val="multilevel"/>
     <w:tmpl w:val="7BA4D048"/>
@@ -9848,7 +10203,7 @@
       </w:rPr>
     </w:lvl>
   </w:abstractNum>
-  <w:abstractNum w:abstractNumId="42" w15:restartNumberingAfterBreak="0">
+  <w:abstractNum w:abstractNumId="44" w15:restartNumberingAfterBreak="0">
     <w:nsid w:val="51112EA2"/>
     <w:multiLevelType w:val="hybridMultilevel"/>
     <w:tmpl w:val="690C7202"/>
@@ -9961,7 +10316,7 @@
       </w:rPr>
     </w:lvl>
   </w:abstractNum>
-  <w:abstractNum w:abstractNumId="43" w15:restartNumberingAfterBreak="0">
+  <w:abstractNum w:abstractNumId="45" w15:restartNumberingAfterBreak="0">
     <w:nsid w:val="53385DD2"/>
     <w:multiLevelType w:val="hybridMultilevel"/>
     <w:tmpl w:val="30EA04A2"/>
@@ -10073,7 +10428,7 @@
       </w:rPr>
     </w:lvl>
   </w:abstractNum>
-  <w:abstractNum w:abstractNumId="44" w15:restartNumberingAfterBreak="0">
+  <w:abstractNum w:abstractNumId="46" w15:restartNumberingAfterBreak="0">
     <w:nsid w:val="55E57E39"/>
     <w:multiLevelType w:val="hybridMultilevel"/>
     <w:tmpl w:val="2A6E31D2"/>
@@ -10186,7 +10541,7 @@
       </w:rPr>
     </w:lvl>
   </w:abstractNum>
-  <w:abstractNum w:abstractNumId="45" w15:restartNumberingAfterBreak="0">
+  <w:abstractNum w:abstractNumId="47" w15:restartNumberingAfterBreak="0">
     <w:nsid w:val="581E50E9"/>
     <w:multiLevelType w:val="hybridMultilevel"/>
     <w:tmpl w:val="0B04D512"/>
@@ -10299,7 +10654,7 @@
       </w:rPr>
     </w:lvl>
   </w:abstractNum>
-  <w:abstractNum w:abstractNumId="46" w15:restartNumberingAfterBreak="0">
+  <w:abstractNum w:abstractNumId="48" w15:restartNumberingAfterBreak="0">
     <w:nsid w:val="5B121D5E"/>
     <w:multiLevelType w:val="multilevel"/>
     <w:tmpl w:val="D0AABB20"/>
@@ -10448,7 +10803,7 @@
       </w:rPr>
     </w:lvl>
   </w:abstractNum>
-  <w:abstractNum w:abstractNumId="47" w15:restartNumberingAfterBreak="0">
+  <w:abstractNum w:abstractNumId="49" w15:restartNumberingAfterBreak="0">
     <w:nsid w:val="5B830032"/>
     <w:multiLevelType w:val="hybridMultilevel"/>
     <w:tmpl w:val="4DF2BC1C"/>
@@ -10561,7 +10916,7 @@
       </w:rPr>
     </w:lvl>
   </w:abstractNum>
-  <w:abstractNum w:abstractNumId="48" w15:restartNumberingAfterBreak="0">
+  <w:abstractNum w:abstractNumId="50" w15:restartNumberingAfterBreak="0">
     <w:nsid w:val="5B8D7ABF"/>
     <w:multiLevelType w:val="multilevel"/>
     <w:tmpl w:val="6B1EF340"/>
@@ -10710,7 +11065,7 @@
       </w:rPr>
     </w:lvl>
   </w:abstractNum>
-  <w:abstractNum w:abstractNumId="49" w15:restartNumberingAfterBreak="0">
+  <w:abstractNum w:abstractNumId="51" w15:restartNumberingAfterBreak="0">
     <w:nsid w:val="5CD94050"/>
     <w:multiLevelType w:val="hybridMultilevel"/>
     <w:tmpl w:val="D818BC54"/>
@@ -10823,7 +11178,7 @@
       </w:rPr>
     </w:lvl>
   </w:abstractNum>
-  <w:abstractNum w:abstractNumId="50" w15:restartNumberingAfterBreak="0">
+  <w:abstractNum w:abstractNumId="52" w15:restartNumberingAfterBreak="0">
     <w:nsid w:val="62257A88"/>
     <w:multiLevelType w:val="hybridMultilevel"/>
     <w:tmpl w:val="EC8E8516"/>
@@ -10936,7 +11291,7 @@
       </w:rPr>
     </w:lvl>
   </w:abstractNum>
-  <w:abstractNum w:abstractNumId="51" w15:restartNumberingAfterBreak="0">
+  <w:abstractNum w:abstractNumId="53" w15:restartNumberingAfterBreak="0">
     <w:nsid w:val="63284DD1"/>
     <w:multiLevelType w:val="hybridMultilevel"/>
     <w:tmpl w:val="1D48A2A0"/>
@@ -11049,7 +11404,7 @@
       </w:rPr>
     </w:lvl>
   </w:abstractNum>
-  <w:abstractNum w:abstractNumId="52" w15:restartNumberingAfterBreak="0">
+  <w:abstractNum w:abstractNumId="54" w15:restartNumberingAfterBreak="0">
     <w:nsid w:val="6677317F"/>
     <w:multiLevelType w:val="hybridMultilevel"/>
     <w:tmpl w:val="41BC1DF0"/>
@@ -11162,7 +11517,7 @@
       </w:rPr>
     </w:lvl>
   </w:abstractNum>
-  <w:abstractNum w:abstractNumId="53" w15:restartNumberingAfterBreak="0">
+  <w:abstractNum w:abstractNumId="55" w15:restartNumberingAfterBreak="0">
     <w:nsid w:val="6C3E6042"/>
     <w:multiLevelType w:val="hybridMultilevel"/>
     <w:tmpl w:val="346A551E"/>
@@ -11275,7 +11630,7 @@
       </w:rPr>
     </w:lvl>
   </w:abstractNum>
-  <w:abstractNum w:abstractNumId="54" w15:restartNumberingAfterBreak="0">
+  <w:abstractNum w:abstractNumId="56" w15:restartNumberingAfterBreak="0">
     <w:nsid w:val="6C611473"/>
     <w:multiLevelType w:val="hybridMultilevel"/>
     <w:tmpl w:val="6E44C386"/>
@@ -11388,7 +11743,7 @@
       </w:rPr>
     </w:lvl>
   </w:abstractNum>
-  <w:abstractNum w:abstractNumId="55" w15:restartNumberingAfterBreak="0">
+  <w:abstractNum w:abstractNumId="57" w15:restartNumberingAfterBreak="0">
     <w:nsid w:val="6DF46EA9"/>
     <w:multiLevelType w:val="multilevel"/>
     <w:tmpl w:val="539842F2"/>
@@ -11537,7 +11892,7 @@
       </w:rPr>
     </w:lvl>
   </w:abstractNum>
-  <w:abstractNum w:abstractNumId="56" w15:restartNumberingAfterBreak="0">
+  <w:abstractNum w:abstractNumId="58" w15:restartNumberingAfterBreak="0">
     <w:nsid w:val="6E186A00"/>
     <w:multiLevelType w:val="multilevel"/>
     <w:tmpl w:val="B2FCE510"/>
@@ -11686,7 +12041,7 @@
       </w:rPr>
     </w:lvl>
   </w:abstractNum>
-  <w:abstractNum w:abstractNumId="57" w15:restartNumberingAfterBreak="0">
+  <w:abstractNum w:abstractNumId="59" w15:restartNumberingAfterBreak="0">
     <w:nsid w:val="6F7A77A3"/>
     <w:multiLevelType w:val="multilevel"/>
     <w:tmpl w:val="E994821E"/>
@@ -11835,7 +12190,7 @@
       </w:rPr>
     </w:lvl>
   </w:abstractNum>
-  <w:abstractNum w:abstractNumId="58" w15:restartNumberingAfterBreak="0">
+  <w:abstractNum w:abstractNumId="60" w15:restartNumberingAfterBreak="0">
     <w:nsid w:val="724C1C35"/>
     <w:multiLevelType w:val="multilevel"/>
     <w:tmpl w:val="9CCE2B2A"/>
@@ -11984,7 +12339,7 @@
       </w:rPr>
     </w:lvl>
   </w:abstractNum>
-  <w:abstractNum w:abstractNumId="59" w15:restartNumberingAfterBreak="0">
+  <w:abstractNum w:abstractNumId="61" w15:restartNumberingAfterBreak="0">
     <w:nsid w:val="72B1453B"/>
     <w:multiLevelType w:val="multilevel"/>
     <w:tmpl w:val="517C5DB4"/>
@@ -12133,7 +12488,7 @@
       </w:rPr>
     </w:lvl>
   </w:abstractNum>
-  <w:abstractNum w:abstractNumId="60" w15:restartNumberingAfterBreak="0">
+  <w:abstractNum w:abstractNumId="62" w15:restartNumberingAfterBreak="0">
     <w:nsid w:val="75AB79DA"/>
     <w:multiLevelType w:val="hybridMultilevel"/>
     <w:tmpl w:val="BC1CF0DE"/>
@@ -12245,7 +12600,7 @@
       </w:rPr>
     </w:lvl>
   </w:abstractNum>
-  <w:abstractNum w:abstractNumId="61" w15:restartNumberingAfterBreak="0">
+  <w:abstractNum w:abstractNumId="63" w15:restartNumberingAfterBreak="0">
     <w:nsid w:val="75D40F67"/>
     <w:multiLevelType w:val="hybridMultilevel"/>
     <w:tmpl w:val="0568CF1E"/>
@@ -12358,7 +12713,7 @@
       </w:rPr>
     </w:lvl>
   </w:abstractNum>
-  <w:abstractNum w:abstractNumId="62" w15:restartNumberingAfterBreak="0">
+  <w:abstractNum w:abstractNumId="64" w15:restartNumberingAfterBreak="0">
     <w:nsid w:val="75F74E94"/>
     <w:multiLevelType w:val="hybridMultilevel"/>
     <w:tmpl w:val="AAEE1DB6"/>
@@ -12471,7 +12826,7 @@
       </w:rPr>
     </w:lvl>
   </w:abstractNum>
-  <w:abstractNum w:abstractNumId="63" w15:restartNumberingAfterBreak="0">
+  <w:abstractNum w:abstractNumId="65" w15:restartNumberingAfterBreak="0">
     <w:nsid w:val="79A5701B"/>
     <w:multiLevelType w:val="hybridMultilevel"/>
     <w:tmpl w:val="0C822F6E"/>
@@ -12584,7 +12939,7 @@
       </w:rPr>
     </w:lvl>
   </w:abstractNum>
-  <w:abstractNum w:abstractNumId="64" w15:restartNumberingAfterBreak="0">
+  <w:abstractNum w:abstractNumId="66" w15:restartNumberingAfterBreak="0">
     <w:nsid w:val="79E17E03"/>
     <w:multiLevelType w:val="multilevel"/>
     <w:tmpl w:val="3276328A"/>
@@ -12733,7 +13088,7 @@
       </w:rPr>
     </w:lvl>
   </w:abstractNum>
-  <w:abstractNum w:abstractNumId="65" w15:restartNumberingAfterBreak="0">
+  <w:abstractNum w:abstractNumId="67" w15:restartNumberingAfterBreak="0">
     <w:nsid w:val="7E445042"/>
     <w:multiLevelType w:val="hybridMultilevel"/>
     <w:tmpl w:val="791A437A"/>
@@ -12847,202 +13202,226 @@
     </w:lvl>
   </w:abstractNum>
   <w:num w:numId="1" w16cid:durableId="1535078586">
+    <w:abstractNumId w:val="36"/>
+  </w:num>
+  <w:num w:numId="2" w16cid:durableId="1948391500">
+    <w:abstractNumId w:val="13"/>
+  </w:num>
+  <w:num w:numId="3" w16cid:durableId="1621448316">
+    <w:abstractNumId w:val="24"/>
+  </w:num>
+  <w:num w:numId="4" w16cid:durableId="1193761069">
+    <w:abstractNumId w:val="10"/>
+  </w:num>
+  <w:num w:numId="5" w16cid:durableId="841966197">
+    <w:abstractNumId w:val="50"/>
+  </w:num>
+  <w:num w:numId="6" w16cid:durableId="972443705">
+    <w:abstractNumId w:val="48"/>
+  </w:num>
+  <w:num w:numId="7" w16cid:durableId="1126436501">
+    <w:abstractNumId w:val="9"/>
+  </w:num>
+  <w:num w:numId="8" w16cid:durableId="2044672405">
+    <w:abstractNumId w:val="3"/>
+  </w:num>
+  <w:num w:numId="9" w16cid:durableId="1612086184">
+    <w:abstractNumId w:val="37"/>
+  </w:num>
+  <w:num w:numId="10" w16cid:durableId="1381174071">
+    <w:abstractNumId w:val="22"/>
+  </w:num>
+  <w:num w:numId="11" w16cid:durableId="765466274">
+    <w:abstractNumId w:val="60"/>
+  </w:num>
+  <w:num w:numId="12" w16cid:durableId="403378464">
+    <w:abstractNumId w:val="61"/>
+  </w:num>
+  <w:num w:numId="13" w16cid:durableId="1828474039">
+    <w:abstractNumId w:val="23"/>
+  </w:num>
+  <w:num w:numId="14" w16cid:durableId="1025600355">
+    <w:abstractNumId w:val="7"/>
+  </w:num>
+  <w:num w:numId="15" w16cid:durableId="1486750023">
+    <w:abstractNumId w:val="21"/>
+  </w:num>
+  <w:num w:numId="16" w16cid:durableId="834105241">
+    <w:abstractNumId w:val="2"/>
+  </w:num>
+  <w:num w:numId="17" w16cid:durableId="1951156466">
+    <w:abstractNumId w:val="30"/>
+  </w:num>
+  <w:num w:numId="18" w16cid:durableId="124009087">
+    <w:abstractNumId w:val="44"/>
+  </w:num>
+  <w:num w:numId="19" w16cid:durableId="354573176">
+    <w:abstractNumId w:val="47"/>
+  </w:num>
+  <w:num w:numId="20" w16cid:durableId="743143960">
+    <w:abstractNumId w:val="28"/>
+  </w:num>
+  <w:num w:numId="21" w16cid:durableId="85658055">
+    <w:abstractNumId w:val="49"/>
+  </w:num>
+  <w:num w:numId="22" w16cid:durableId="280764301">
+    <w:abstractNumId w:val="27"/>
+  </w:num>
+  <w:num w:numId="23" w16cid:durableId="1718554326">
+    <w:abstractNumId w:val="52"/>
+  </w:num>
+  <w:num w:numId="24" w16cid:durableId="1800802676">
+    <w:abstractNumId w:val="35"/>
+  </w:num>
+  <w:num w:numId="25" w16cid:durableId="1620063659">
+    <w:abstractNumId w:val="15"/>
+  </w:num>
+  <w:num w:numId="26" w16cid:durableId="1008218090">
+    <w:abstractNumId w:val="53"/>
+  </w:num>
+  <w:num w:numId="27" w16cid:durableId="767191025">
+    <w:abstractNumId w:val="38"/>
+  </w:num>
+  <w:num w:numId="28" w16cid:durableId="2063475255">
+    <w:abstractNumId w:val="39"/>
+  </w:num>
+  <w:num w:numId="29" w16cid:durableId="495535857">
+    <w:abstractNumId w:val="41"/>
+  </w:num>
+  <w:num w:numId="30" w16cid:durableId="1969816244">
+    <w:abstractNumId w:val="56"/>
+  </w:num>
+  <w:num w:numId="31" w16cid:durableId="72356380">
+    <w:abstractNumId w:val="63"/>
+  </w:num>
+  <w:num w:numId="32" w16cid:durableId="2018118198">
+    <w:abstractNumId w:val="51"/>
+  </w:num>
+  <w:num w:numId="33" w16cid:durableId="62140243">
+    <w:abstractNumId w:val="11"/>
+  </w:num>
+  <w:num w:numId="34" w16cid:durableId="534389351">
+    <w:abstractNumId w:val="8"/>
+  </w:num>
+  <w:num w:numId="35" w16cid:durableId="851450492">
+    <w:abstractNumId w:val="18"/>
+  </w:num>
+  <w:num w:numId="36" w16cid:durableId="976881214">
+    <w:abstractNumId w:val="29"/>
+  </w:num>
+  <w:num w:numId="37" w16cid:durableId="1679505294">
+    <w:abstractNumId w:val="67"/>
+  </w:num>
+  <w:num w:numId="38" w16cid:durableId="1846361536">
     <w:abstractNumId w:val="34"/>
   </w:num>
-  <w:num w:numId="2" w16cid:durableId="1948391500">
-    <w:abstractNumId w:val="11"/>
+  <w:num w:numId="39" w16cid:durableId="1207060485">
+    <w:abstractNumId w:val="14"/>
   </w:num>
-  <w:num w:numId="3" w16cid:durableId="1621448316">
-    <w:abstractNumId w:val="22"/>
+  <w:num w:numId="40" w16cid:durableId="274488848">
+    <w:abstractNumId w:val="45"/>
   </w:num>
-  <w:num w:numId="4" w16cid:durableId="1193761069">
-    <w:abstractNumId w:val="8"/>
+  <w:num w:numId="41" w16cid:durableId="229124511">
+    <w:abstractNumId w:val="55"/>
   </w:num>
-  <w:num w:numId="5" w16cid:durableId="841966197">
-    <w:abstractNumId w:val="48"/>
-  </w:num>
-  <w:num w:numId="6" w16cid:durableId="972443705">
-    <w:abstractNumId w:val="46"/>
-  </w:num>
-  <w:num w:numId="7" w16cid:durableId="1126436501">
-    <w:abstractNumId w:val="7"/>
-  </w:num>
-  <w:num w:numId="8" w16cid:durableId="2044672405">
-    <w:abstractNumId w:val="2"/>
-  </w:num>
-  <w:num w:numId="9" w16cid:durableId="1612086184">
-    <w:abstractNumId w:val="35"/>
-  </w:num>
-  <w:num w:numId="10" w16cid:durableId="1381174071">
-    <w:abstractNumId w:val="20"/>
-  </w:num>
-  <w:num w:numId="11" w16cid:durableId="765466274">
+  <w:num w:numId="42" w16cid:durableId="739979292">
     <w:abstractNumId w:val="58"/>
   </w:num>
-  <w:num w:numId="12" w16cid:durableId="403378464">
-    <w:abstractNumId w:val="59"/>
+  <w:num w:numId="43" w16cid:durableId="1683235975">
+    <w:abstractNumId w:val="57"/>
   </w:num>
-  <w:num w:numId="13" w16cid:durableId="1828474039">
-    <w:abstractNumId w:val="21"/>
+  <w:num w:numId="44" w16cid:durableId="849025585">
+    <w:abstractNumId w:val="66"/>
   </w:num>
-  <w:num w:numId="14" w16cid:durableId="1025600355">
-    <w:abstractNumId w:val="5"/>
+  <w:num w:numId="45" w16cid:durableId="657417764">
+    <w:abstractNumId w:val="6"/>
   </w:num>
-  <w:num w:numId="15" w16cid:durableId="1486750023">
-    <w:abstractNumId w:val="19"/>
+  <w:num w:numId="46" w16cid:durableId="1954357767">
+    <w:abstractNumId w:val="43"/>
   </w:num>
-  <w:num w:numId="16" w16cid:durableId="834105241">
-    <w:abstractNumId w:val="1"/>
-  </w:num>
-  <w:num w:numId="17" w16cid:durableId="1951156466">
-    <w:abstractNumId w:val="28"/>
-  </w:num>
-  <w:num w:numId="18" w16cid:durableId="124009087">
-    <w:abstractNumId w:val="42"/>
-  </w:num>
-  <w:num w:numId="19" w16cid:durableId="354573176">
-    <w:abstractNumId w:val="45"/>
-  </w:num>
-  <w:num w:numId="20" w16cid:durableId="743143960">
+  <w:num w:numId="47" w16cid:durableId="76293958">
     <w:abstractNumId w:val="26"/>
   </w:num>
-  <w:num w:numId="21" w16cid:durableId="85658055">
-    <w:abstractNumId w:val="47"/>
-  </w:num>
-  <w:num w:numId="22" w16cid:durableId="280764301">
-    <w:abstractNumId w:val="25"/>
-  </w:num>
-  <w:num w:numId="23" w16cid:durableId="1718554326">
-    <w:abstractNumId w:val="50"/>
-  </w:num>
-  <w:num w:numId="24" w16cid:durableId="1800802676">
-    <w:abstractNumId w:val="33"/>
-  </w:num>
-  <w:num w:numId="25" w16cid:durableId="1620063659">
-    <w:abstractNumId w:val="13"/>
-  </w:num>
-  <w:num w:numId="26" w16cid:durableId="1008218090">
-    <w:abstractNumId w:val="51"/>
-  </w:num>
-  <w:num w:numId="27" w16cid:durableId="767191025">
-    <w:abstractNumId w:val="36"/>
-  </w:num>
-  <w:num w:numId="28" w16cid:durableId="2063475255">
-    <w:abstractNumId w:val="37"/>
-  </w:num>
-  <w:num w:numId="29" w16cid:durableId="495535857">
-    <w:abstractNumId w:val="39"/>
-  </w:num>
-  <w:num w:numId="30" w16cid:durableId="1969816244">
-    <w:abstractNumId w:val="54"/>
-  </w:num>
-  <w:num w:numId="31" w16cid:durableId="72356380">
-    <w:abstractNumId w:val="61"/>
-  </w:num>
-  <w:num w:numId="32" w16cid:durableId="2018118198">
-    <w:abstractNumId w:val="49"/>
-  </w:num>
-  <w:num w:numId="33" w16cid:durableId="62140243">
-    <w:abstractNumId w:val="9"/>
-  </w:num>
-  <w:num w:numId="34" w16cid:durableId="534389351">
-    <w:abstractNumId w:val="6"/>
-  </w:num>
-  <w:num w:numId="35" w16cid:durableId="851450492">
-    <w:abstractNumId w:val="16"/>
-  </w:num>
-  <w:num w:numId="36" w16cid:durableId="976881214">
-    <w:abstractNumId w:val="27"/>
-  </w:num>
-  <w:num w:numId="37" w16cid:durableId="1679505294">
-    <w:abstractNumId w:val="65"/>
-  </w:num>
-  <w:num w:numId="38" w16cid:durableId="1846361536">
-    <w:abstractNumId w:val="32"/>
-  </w:num>
-  <w:num w:numId="39" w16cid:durableId="1207060485">
-    <w:abstractNumId w:val="12"/>
-  </w:num>
-  <w:num w:numId="40" w16cid:durableId="274488848">
-    <w:abstractNumId w:val="43"/>
-  </w:num>
-  <w:num w:numId="41" w16cid:durableId="229124511">
-    <w:abstractNumId w:val="53"/>
-  </w:num>
-  <w:num w:numId="42" w16cid:durableId="739979292">
-    <w:abstractNumId w:val="56"/>
-  </w:num>
-  <w:num w:numId="43" w16cid:durableId="1683235975">
-    <w:abstractNumId w:val="55"/>
-  </w:num>
-  <w:num w:numId="44" w16cid:durableId="849025585">
-    <w:abstractNumId w:val="64"/>
-  </w:num>
-  <w:num w:numId="45" w16cid:durableId="657417764">
-    <w:abstractNumId w:val="4"/>
-  </w:num>
-  <w:num w:numId="46" w16cid:durableId="1954357767">
-    <w:abstractNumId w:val="41"/>
-  </w:num>
-  <w:num w:numId="47" w16cid:durableId="76293958">
-    <w:abstractNumId w:val="24"/>
-  </w:num>
   <w:num w:numId="48" w16cid:durableId="318771837">
-    <w:abstractNumId w:val="57"/>
+    <w:abstractNumId w:val="59"/>
   </w:num>
   <w:num w:numId="49" w16cid:durableId="447628007">
     <w:abstractNumId w:val="0"/>
   </w:num>
   <w:num w:numId="50" w16cid:durableId="2112625642">
+    <w:abstractNumId w:val="42"/>
+  </w:num>
+  <w:num w:numId="51" w16cid:durableId="1513953642">
+    <w:abstractNumId w:val="25"/>
+  </w:num>
+  <w:num w:numId="52" w16cid:durableId="1968200734">
+    <w:abstractNumId w:val="33"/>
+  </w:num>
+  <w:num w:numId="53" w16cid:durableId="1503356612">
+    <w:abstractNumId w:val="32"/>
+  </w:num>
+  <w:num w:numId="54" w16cid:durableId="820149342">
+    <w:abstractNumId w:val="54"/>
+  </w:num>
+  <w:num w:numId="55" w16cid:durableId="670596147">
+    <w:abstractNumId w:val="65"/>
+  </w:num>
+  <w:num w:numId="56" w16cid:durableId="1342048060">
+    <w:abstractNumId w:val="62"/>
+  </w:num>
+  <w:num w:numId="57" w16cid:durableId="1809085698">
+    <w:abstractNumId w:val="17"/>
+  </w:num>
+  <w:num w:numId="58" w16cid:durableId="1022055736">
+    <w:abstractNumId w:val="19"/>
+  </w:num>
+  <w:num w:numId="59" w16cid:durableId="1136334374">
     <w:abstractNumId w:val="40"/>
   </w:num>
-  <w:num w:numId="51" w16cid:durableId="1513953642">
-    <w:abstractNumId w:val="23"/>
+  <w:num w:numId="60" w16cid:durableId="1710103756">
+    <w:abstractNumId w:val="16"/>
   </w:num>
-  <w:num w:numId="52" w16cid:durableId="1968200734">
+  <w:num w:numId="61" w16cid:durableId="1898932818">
+    <w:abstractNumId w:val="12"/>
+  </w:num>
+  <w:num w:numId="62" w16cid:durableId="1767850541">
+    <w:abstractNumId w:val="64"/>
+  </w:num>
+  <w:num w:numId="63" w16cid:durableId="16852692">
+    <w:abstractNumId w:val="46"/>
+  </w:num>
+  <w:num w:numId="64" w16cid:durableId="1619485396">
     <w:abstractNumId w:val="31"/>
   </w:num>
-  <w:num w:numId="53" w16cid:durableId="1503356612">
-    <w:abstractNumId w:val="30"/>
-  </w:num>
-  <w:num w:numId="54" w16cid:durableId="820149342">
-    <w:abstractNumId w:val="52"/>
-  </w:num>
-  <w:num w:numId="55" w16cid:durableId="670596147">
-    <w:abstractNumId w:val="63"/>
-  </w:num>
-  <w:num w:numId="56" w16cid:durableId="1342048060">
-    <w:abstractNumId w:val="60"/>
-  </w:num>
-  <w:num w:numId="57" w16cid:durableId="1809085698">
-    <w:abstractNumId w:val="15"/>
-  </w:num>
-  <w:num w:numId="58" w16cid:durableId="1022055736">
-    <w:abstractNumId w:val="17"/>
-  </w:num>
-  <w:num w:numId="59" w16cid:durableId="1136334374">
-    <w:abstractNumId w:val="38"/>
-  </w:num>
-  <w:num w:numId="60" w16cid:durableId="1710103756">
-    <w:abstractNumId w:val="14"/>
-  </w:num>
-  <w:num w:numId="61" w16cid:durableId="1898932818">
-    <w:abstractNumId w:val="10"/>
-  </w:num>
-  <w:num w:numId="62" w16cid:durableId="1767850541">
-    <w:abstractNumId w:val="62"/>
-  </w:num>
-  <w:num w:numId="63" w16cid:durableId="16852692">
-    <w:abstractNumId w:val="44"/>
-  </w:num>
-  <w:num w:numId="64" w16cid:durableId="1619485396">
-    <w:abstractNumId w:val="29"/>
-  </w:num>
   <w:num w:numId="65" w16cid:durableId="431824117">
-    <w:abstractNumId w:val="18"/>
+    <w:abstractNumId w:val="20"/>
   </w:num>
   <w:num w:numId="66" w16cid:durableId="1055936744">
-    <w:abstractNumId w:val="3"/>
+    <w:abstractNumId w:val="5"/>
+  </w:num>
+  <w:num w:numId="67" w16cid:durableId="411901386">
+    <w:abstractNumId w:val="1"/>
+    <w:lvlOverride w:ilvl="0"/>
+    <w:lvlOverride w:ilvl="1"/>
+    <w:lvlOverride w:ilvl="2"/>
+    <w:lvlOverride w:ilvl="3"/>
+    <w:lvlOverride w:ilvl="4"/>
+    <w:lvlOverride w:ilvl="5"/>
+    <w:lvlOverride w:ilvl="6"/>
+    <w:lvlOverride w:ilvl="7"/>
+    <w:lvlOverride w:ilvl="8"/>
+  </w:num>
+  <w:num w:numId="68" w16cid:durableId="1262101279">
+    <w:abstractNumId w:val="4"/>
+    <w:lvlOverride w:ilvl="0"/>
+    <w:lvlOverride w:ilvl="1"/>
+    <w:lvlOverride w:ilvl="2"/>
+    <w:lvlOverride w:ilvl="3"/>
+    <w:lvlOverride w:ilvl="4"/>
+    <w:lvlOverride w:ilvl="5"/>
+    <w:lvlOverride w:ilvl="6"/>
+    <w:lvlOverride w:ilvl="7"/>
+    <w:lvlOverride w:ilvl="8"/>
   </w:num>
 </w:numbering>
 </file>
@@ -13526,7 +13905,6 @@
   <w:style w:type="character" w:default="1" w:styleId="DefaultParagraphFont">
     <w:name w:val="Default Paragraph Font"/>
     <w:uiPriority w:val="1"/>
-    <w:semiHidden/>
     <w:unhideWhenUsed/>
   </w:style>
   <w:style w:type="table" w:default="1" w:styleId="TableNormal">

</xml_diff>